<commit_message>
Chapter 4 draft: add Table A.6 (summary of Adaptive reductions) and reference it in Section 4.6
Co-Authored-By: Claude Sonnet 5.5 <noreply@anthropic.com>
Claude-Session: https://claude.ai/code/session_01T6gEewJ8YaCdmnsfS34RJd
</commit_message>
<xml_diff>
--- a/results/Chapter_4_final.docx
+++ b/results/Chapter_4_final.docx
@@ -12161,7 +12161,7 @@
           <w:b w:val="0"/>
           <w:i w:val="0"/>
         </w:rPr>
-        <w:t>The Adaptive strategy reduced the LBG time of all eight images at every process count from P = 8 to P = 14. The mean reduction over the eight images was 28.3% at P = 8, and decreased to 23.6%, 19.8%, and 17.2% at P = 10, 12, and 14, respectively. The reduction varied little among the images; for example, it ranged from 28.0% to 28.5% at P = 8 and from 16.8% to 17.8% at P = 14.</w:t>
+        <w:t>The Adaptive strategy reduced the LBG time of all eight images at every process count from P = 8 to P = 14. The mean reduction over the eight images was 28.3% at P = 8, and decreased to 23.6%, 19.8%, and 17.2% at P = 10, 12, and 14, respectively. The reduction varied little among the images (Appendix A, Table A.6); for example, it ranged from 28.0% to 28.5% at P = 8 and from 16.8% to 17.8% at P = 14.</w:t>
       </w:r>
     </w:p>
     <w:p>
@@ -20585,6 +20585,1175 @@
       <w:pPr>
         <w:spacing w:after="80"/>
       </w:pPr>
+    </w:p>
+    <w:p>
+      <w:pPr>
+        <w:pStyle w:val="Heading3"/>
+      </w:pPr>
+      <w:r>
+        <w:t>A.6 Summary of the reductions achieved by the Adaptive strategy</w:t>
+      </w:r>
+    </w:p>
+    <w:p>
+      <w:pPr>
+        <w:keepNext/>
+        <w:spacing w:after="60" w:line="276" w:lineRule="auto"/>
+      </w:pPr>
+      <w:r>
+        <w:rPr>
+          <w:b/>
+          <w:i w:val="0"/>
+        </w:rPr>
+        <w:t>Table A.6. Mean, minimum, and maximum reduction (%) of the LBG time and of the total time achieved by the Adaptive strategy over the eight images.</w:t>
+      </w:r>
+    </w:p>
+    <w:tbl>
+      <w:tblPr>
+        <w:tblStyle w:val="TableGrid"/>
+        <w:tblW w:type="auto" w:w="0"/>
+        <w:jc w:val="center"/>
+        <w:tblLook w:firstColumn="1" w:firstRow="1" w:lastColumn="0" w:lastRow="0" w:noHBand="0" w:noVBand="1" w:val="04A0"/>
+      </w:tblPr>
+      <w:tblGrid>
+        <w:gridCol w:w="1134"/>
+        <w:gridCol w:w="1134"/>
+        <w:gridCol w:w="1134"/>
+        <w:gridCol w:w="1134"/>
+        <w:gridCol w:w="1134"/>
+        <w:gridCol w:w="1134"/>
+        <w:gridCol w:w="1134"/>
+        <w:gridCol w:w="1134"/>
+      </w:tblGrid>
+      <w:tr>
+        <w:tc>
+          <w:tcPr>
+            <w:tcW w:type="dxa" w:w="1134"/>
+          </w:tcPr>
+          <w:p>
+            <w:pPr>
+              <w:jc w:val="center"/>
+            </w:pPr>
+            <w:r/>
+            <w:r>
+              <w:rPr>
+                <w:b/>
+                <w:sz w:val="18"/>
+              </w:rPr>
+              <w:t>P</w:t>
+            </w:r>
+          </w:p>
+        </w:tc>
+        <w:tc>
+          <w:tcPr>
+            <w:tcW w:type="dxa" w:w="1134"/>
+          </w:tcPr>
+          <w:p>
+            <w:pPr>
+              <w:jc w:val="center"/>
+            </w:pPr>
+            <w:r/>
+            <w:r>
+              <w:rPr>
+                <w:b/>
+                <w:sz w:val="18"/>
+              </w:rPr>
+              <w:t>LBG mean</w:t>
+            </w:r>
+          </w:p>
+        </w:tc>
+        <w:tc>
+          <w:tcPr>
+            <w:tcW w:type="dxa" w:w="1134"/>
+          </w:tcPr>
+          <w:p>
+            <w:pPr>
+              <w:jc w:val="center"/>
+            </w:pPr>
+            <w:r/>
+            <w:r>
+              <w:rPr>
+                <w:b/>
+                <w:sz w:val="18"/>
+              </w:rPr>
+              <w:t>LBG min</w:t>
+            </w:r>
+          </w:p>
+        </w:tc>
+        <w:tc>
+          <w:tcPr>
+            <w:tcW w:type="dxa" w:w="1134"/>
+          </w:tcPr>
+          <w:p>
+            <w:pPr>
+              <w:jc w:val="center"/>
+            </w:pPr>
+            <w:r/>
+            <w:r>
+              <w:rPr>
+                <w:b/>
+                <w:sz w:val="18"/>
+              </w:rPr>
+              <w:t>LBG max</w:t>
+            </w:r>
+          </w:p>
+        </w:tc>
+        <w:tc>
+          <w:tcPr>
+            <w:tcW w:type="dxa" w:w="1134"/>
+          </w:tcPr>
+          <w:p>
+            <w:pPr>
+              <w:jc w:val="center"/>
+            </w:pPr>
+            <w:r/>
+            <w:r>
+              <w:rPr>
+                <w:b/>
+                <w:sz w:val="18"/>
+              </w:rPr>
+              <w:t>Total mean</w:t>
+            </w:r>
+          </w:p>
+        </w:tc>
+        <w:tc>
+          <w:tcPr>
+            <w:tcW w:type="dxa" w:w="1134"/>
+          </w:tcPr>
+          <w:p>
+            <w:pPr>
+              <w:jc w:val="center"/>
+            </w:pPr>
+            <w:r/>
+            <w:r>
+              <w:rPr>
+                <w:b/>
+                <w:sz w:val="18"/>
+              </w:rPr>
+              <w:t>Total min</w:t>
+            </w:r>
+          </w:p>
+        </w:tc>
+        <w:tc>
+          <w:tcPr>
+            <w:tcW w:type="dxa" w:w="1134"/>
+          </w:tcPr>
+          <w:p>
+            <w:pPr>
+              <w:jc w:val="center"/>
+            </w:pPr>
+            <w:r/>
+            <w:r>
+              <w:rPr>
+                <w:b/>
+                <w:sz w:val="18"/>
+              </w:rPr>
+              <w:t>Total max</w:t>
+            </w:r>
+          </w:p>
+        </w:tc>
+        <w:tc>
+          <w:tcPr>
+            <w:tcW w:type="dxa" w:w="1134"/>
+          </w:tcPr>
+          <w:p>
+            <w:pPr>
+              <w:jc w:val="center"/>
+            </w:pPr>
+            <w:r/>
+            <w:r>
+              <w:rPr>
+                <w:b/>
+                <w:sz w:val="18"/>
+              </w:rPr>
+              <w:t>Images with total reduction &gt; 1%</w:t>
+            </w:r>
+          </w:p>
+        </w:tc>
+      </w:tr>
+      <w:tr>
+        <w:tc>
+          <w:tcPr>
+            <w:tcW w:type="dxa" w:w="1134"/>
+          </w:tcPr>
+          <w:p>
+            <w:pPr>
+              <w:jc w:val="left"/>
+            </w:pPr>
+            <w:r/>
+            <w:r>
+              <w:rPr>
+                <w:sz w:val="18"/>
+              </w:rPr>
+              <w:t>2</w:t>
+            </w:r>
+          </w:p>
+        </w:tc>
+        <w:tc>
+          <w:tcPr>
+            <w:tcW w:type="dxa" w:w="1134"/>
+          </w:tcPr>
+          <w:p>
+            <w:pPr>
+              <w:jc w:val="center"/>
+            </w:pPr>
+            <w:r/>
+            <w:r>
+              <w:rPr>
+                <w:sz w:val="18"/>
+              </w:rPr>
+              <w:t>-0.1</w:t>
+            </w:r>
+          </w:p>
+        </w:tc>
+        <w:tc>
+          <w:tcPr>
+            <w:tcW w:type="dxa" w:w="1134"/>
+          </w:tcPr>
+          <w:p>
+            <w:pPr>
+              <w:jc w:val="center"/>
+            </w:pPr>
+            <w:r/>
+            <w:r>
+              <w:rPr>
+                <w:sz w:val="18"/>
+              </w:rPr>
+              <w:t>-0.2</w:t>
+            </w:r>
+          </w:p>
+        </w:tc>
+        <w:tc>
+          <w:tcPr>
+            <w:tcW w:type="dxa" w:w="1134"/>
+          </w:tcPr>
+          <w:p>
+            <w:pPr>
+              <w:jc w:val="center"/>
+            </w:pPr>
+            <w:r/>
+            <w:r>
+              <w:rPr>
+                <w:sz w:val="18"/>
+              </w:rPr>
+              <w:t>0.1</w:t>
+            </w:r>
+          </w:p>
+        </w:tc>
+        <w:tc>
+          <w:tcPr>
+            <w:tcW w:type="dxa" w:w="1134"/>
+          </w:tcPr>
+          <w:p>
+            <w:pPr>
+              <w:jc w:val="center"/>
+            </w:pPr>
+            <w:r/>
+            <w:r>
+              <w:rPr>
+                <w:sz w:val="18"/>
+              </w:rPr>
+              <w:t>-0.3</w:t>
+            </w:r>
+          </w:p>
+        </w:tc>
+        <w:tc>
+          <w:tcPr>
+            <w:tcW w:type="dxa" w:w="1134"/>
+          </w:tcPr>
+          <w:p>
+            <w:pPr>
+              <w:jc w:val="center"/>
+            </w:pPr>
+            <w:r/>
+            <w:r>
+              <w:rPr>
+                <w:sz w:val="18"/>
+              </w:rPr>
+              <w:t>-0.6</w:t>
+            </w:r>
+          </w:p>
+        </w:tc>
+        <w:tc>
+          <w:tcPr>
+            <w:tcW w:type="dxa" w:w="1134"/>
+          </w:tcPr>
+          <w:p>
+            <w:pPr>
+              <w:jc w:val="center"/>
+            </w:pPr>
+            <w:r/>
+            <w:r>
+              <w:rPr>
+                <w:sz w:val="18"/>
+              </w:rPr>
+              <w:t>0.0</w:t>
+            </w:r>
+          </w:p>
+        </w:tc>
+        <w:tc>
+          <w:tcPr>
+            <w:tcW w:type="dxa" w:w="1134"/>
+          </w:tcPr>
+          <w:p>
+            <w:pPr>
+              <w:jc w:val="center"/>
+            </w:pPr>
+            <w:r/>
+            <w:r>
+              <w:rPr>
+                <w:sz w:val="18"/>
+              </w:rPr>
+              <w:t>0 of 8</w:t>
+            </w:r>
+          </w:p>
+        </w:tc>
+      </w:tr>
+      <w:tr>
+        <w:tc>
+          <w:tcPr>
+            <w:tcW w:type="dxa" w:w="1134"/>
+          </w:tcPr>
+          <w:p>
+            <w:pPr>
+              <w:jc w:val="left"/>
+            </w:pPr>
+            <w:r/>
+            <w:r>
+              <w:rPr>
+                <w:sz w:val="18"/>
+              </w:rPr>
+              <w:t>4</w:t>
+            </w:r>
+          </w:p>
+        </w:tc>
+        <w:tc>
+          <w:tcPr>
+            <w:tcW w:type="dxa" w:w="1134"/>
+          </w:tcPr>
+          <w:p>
+            <w:pPr>
+              <w:jc w:val="center"/>
+            </w:pPr>
+            <w:r/>
+            <w:r>
+              <w:rPr>
+                <w:sz w:val="18"/>
+              </w:rPr>
+              <w:t>-0.2</w:t>
+            </w:r>
+          </w:p>
+        </w:tc>
+        <w:tc>
+          <w:tcPr>
+            <w:tcW w:type="dxa" w:w="1134"/>
+          </w:tcPr>
+          <w:p>
+            <w:pPr>
+              <w:jc w:val="center"/>
+            </w:pPr>
+            <w:r/>
+            <w:r>
+              <w:rPr>
+                <w:sz w:val="18"/>
+              </w:rPr>
+              <w:t>-1.3</w:t>
+            </w:r>
+          </w:p>
+        </w:tc>
+        <w:tc>
+          <w:tcPr>
+            <w:tcW w:type="dxa" w:w="1134"/>
+          </w:tcPr>
+          <w:p>
+            <w:pPr>
+              <w:jc w:val="center"/>
+            </w:pPr>
+            <w:r/>
+            <w:r>
+              <w:rPr>
+                <w:sz w:val="18"/>
+              </w:rPr>
+              <w:t>0.5</w:t>
+            </w:r>
+          </w:p>
+        </w:tc>
+        <w:tc>
+          <w:tcPr>
+            <w:tcW w:type="dxa" w:w="1134"/>
+          </w:tcPr>
+          <w:p>
+            <w:pPr>
+              <w:jc w:val="center"/>
+            </w:pPr>
+            <w:r/>
+            <w:r>
+              <w:rPr>
+                <w:sz w:val="18"/>
+              </w:rPr>
+              <w:t>-0.6</w:t>
+            </w:r>
+          </w:p>
+        </w:tc>
+        <w:tc>
+          <w:tcPr>
+            <w:tcW w:type="dxa" w:w="1134"/>
+          </w:tcPr>
+          <w:p>
+            <w:pPr>
+              <w:jc w:val="center"/>
+            </w:pPr>
+            <w:r/>
+            <w:r>
+              <w:rPr>
+                <w:sz w:val="18"/>
+              </w:rPr>
+              <w:t>-1.1</w:t>
+            </w:r>
+          </w:p>
+        </w:tc>
+        <w:tc>
+          <w:tcPr>
+            <w:tcW w:type="dxa" w:w="1134"/>
+          </w:tcPr>
+          <w:p>
+            <w:pPr>
+              <w:jc w:val="center"/>
+            </w:pPr>
+            <w:r/>
+            <w:r>
+              <w:rPr>
+                <w:sz w:val="18"/>
+              </w:rPr>
+              <w:t>0.0</w:t>
+            </w:r>
+          </w:p>
+        </w:tc>
+        <w:tc>
+          <w:tcPr>
+            <w:tcW w:type="dxa" w:w="1134"/>
+          </w:tcPr>
+          <w:p>
+            <w:pPr>
+              <w:jc w:val="center"/>
+            </w:pPr>
+            <w:r/>
+            <w:r>
+              <w:rPr>
+                <w:sz w:val="18"/>
+              </w:rPr>
+              <w:t>0 of 8</w:t>
+            </w:r>
+          </w:p>
+        </w:tc>
+      </w:tr>
+      <w:tr>
+        <w:tc>
+          <w:tcPr>
+            <w:tcW w:type="dxa" w:w="1134"/>
+          </w:tcPr>
+          <w:p>
+            <w:pPr>
+              <w:jc w:val="left"/>
+            </w:pPr>
+            <w:r/>
+            <w:r>
+              <w:rPr>
+                <w:sz w:val="18"/>
+              </w:rPr>
+              <w:t>6</w:t>
+            </w:r>
+          </w:p>
+        </w:tc>
+        <w:tc>
+          <w:tcPr>
+            <w:tcW w:type="dxa" w:w="1134"/>
+          </w:tcPr>
+          <w:p>
+            <w:pPr>
+              <w:jc w:val="center"/>
+            </w:pPr>
+            <w:r/>
+            <w:r>
+              <w:rPr>
+                <w:sz w:val="18"/>
+              </w:rPr>
+              <w:t>-0.1</w:t>
+            </w:r>
+          </w:p>
+        </w:tc>
+        <w:tc>
+          <w:tcPr>
+            <w:tcW w:type="dxa" w:w="1134"/>
+          </w:tcPr>
+          <w:p>
+            <w:pPr>
+              <w:jc w:val="center"/>
+            </w:pPr>
+            <w:r/>
+            <w:r>
+              <w:rPr>
+                <w:sz w:val="18"/>
+              </w:rPr>
+              <w:t>-0.8</w:t>
+            </w:r>
+          </w:p>
+        </w:tc>
+        <w:tc>
+          <w:tcPr>
+            <w:tcW w:type="dxa" w:w="1134"/>
+          </w:tcPr>
+          <w:p>
+            <w:pPr>
+              <w:jc w:val="center"/>
+            </w:pPr>
+            <w:r/>
+            <w:r>
+              <w:rPr>
+                <w:sz w:val="18"/>
+              </w:rPr>
+              <w:t>0.5</w:t>
+            </w:r>
+          </w:p>
+        </w:tc>
+        <w:tc>
+          <w:tcPr>
+            <w:tcW w:type="dxa" w:w="1134"/>
+          </w:tcPr>
+          <w:p>
+            <w:pPr>
+              <w:jc w:val="center"/>
+            </w:pPr>
+            <w:r/>
+            <w:r>
+              <w:rPr>
+                <w:sz w:val="18"/>
+              </w:rPr>
+              <w:t>-0.6</w:t>
+            </w:r>
+          </w:p>
+        </w:tc>
+        <w:tc>
+          <w:tcPr>
+            <w:tcW w:type="dxa" w:w="1134"/>
+          </w:tcPr>
+          <w:p>
+            <w:pPr>
+              <w:jc w:val="center"/>
+            </w:pPr>
+            <w:r/>
+            <w:r>
+              <w:rPr>
+                <w:sz w:val="18"/>
+              </w:rPr>
+              <w:t>-1.2</w:t>
+            </w:r>
+          </w:p>
+        </w:tc>
+        <w:tc>
+          <w:tcPr>
+            <w:tcW w:type="dxa" w:w="1134"/>
+          </w:tcPr>
+          <w:p>
+            <w:pPr>
+              <w:jc w:val="center"/>
+            </w:pPr>
+            <w:r/>
+            <w:r>
+              <w:rPr>
+                <w:sz w:val="18"/>
+              </w:rPr>
+              <w:t>0.0</w:t>
+            </w:r>
+          </w:p>
+        </w:tc>
+        <w:tc>
+          <w:tcPr>
+            <w:tcW w:type="dxa" w:w="1134"/>
+          </w:tcPr>
+          <w:p>
+            <w:pPr>
+              <w:jc w:val="center"/>
+            </w:pPr>
+            <w:r/>
+            <w:r>
+              <w:rPr>
+                <w:sz w:val="18"/>
+              </w:rPr>
+              <w:t>0 of 8</w:t>
+            </w:r>
+          </w:p>
+        </w:tc>
+      </w:tr>
+      <w:tr>
+        <w:tc>
+          <w:tcPr>
+            <w:tcW w:type="dxa" w:w="1134"/>
+          </w:tcPr>
+          <w:p>
+            <w:pPr>
+              <w:jc w:val="left"/>
+            </w:pPr>
+            <w:r/>
+            <w:r>
+              <w:rPr>
+                <w:sz w:val="18"/>
+              </w:rPr>
+              <w:t>8</w:t>
+            </w:r>
+          </w:p>
+        </w:tc>
+        <w:tc>
+          <w:tcPr>
+            <w:tcW w:type="dxa" w:w="1134"/>
+          </w:tcPr>
+          <w:p>
+            <w:pPr>
+              <w:jc w:val="center"/>
+            </w:pPr>
+            <w:r/>
+            <w:r>
+              <w:rPr>
+                <w:sz w:val="18"/>
+              </w:rPr>
+              <w:t>28.3</w:t>
+            </w:r>
+          </w:p>
+        </w:tc>
+        <w:tc>
+          <w:tcPr>
+            <w:tcW w:type="dxa" w:w="1134"/>
+          </w:tcPr>
+          <w:p>
+            <w:pPr>
+              <w:jc w:val="center"/>
+            </w:pPr>
+            <w:r/>
+            <w:r>
+              <w:rPr>
+                <w:sz w:val="18"/>
+              </w:rPr>
+              <w:t>28.0</w:t>
+            </w:r>
+          </w:p>
+        </w:tc>
+        <w:tc>
+          <w:tcPr>
+            <w:tcW w:type="dxa" w:w="1134"/>
+          </w:tcPr>
+          <w:p>
+            <w:pPr>
+              <w:jc w:val="center"/>
+            </w:pPr>
+            <w:r/>
+            <w:r>
+              <w:rPr>
+                <w:sz w:val="18"/>
+              </w:rPr>
+              <w:t>28.5</w:t>
+            </w:r>
+          </w:p>
+        </w:tc>
+        <w:tc>
+          <w:tcPr>
+            <w:tcW w:type="dxa" w:w="1134"/>
+          </w:tcPr>
+          <w:p>
+            <w:pPr>
+              <w:jc w:val="center"/>
+            </w:pPr>
+            <w:r/>
+            <w:r>
+              <w:rPr>
+                <w:sz w:val="18"/>
+              </w:rPr>
+              <w:t>17.9</w:t>
+            </w:r>
+          </w:p>
+        </w:tc>
+        <w:tc>
+          <w:tcPr>
+            <w:tcW w:type="dxa" w:w="1134"/>
+          </w:tcPr>
+          <w:p>
+            <w:pPr>
+              <w:jc w:val="center"/>
+            </w:pPr>
+            <w:r/>
+            <w:r>
+              <w:rPr>
+                <w:sz w:val="18"/>
+              </w:rPr>
+              <w:t>14.9</w:t>
+            </w:r>
+          </w:p>
+        </w:tc>
+        <w:tc>
+          <w:tcPr>
+            <w:tcW w:type="dxa" w:w="1134"/>
+          </w:tcPr>
+          <w:p>
+            <w:pPr>
+              <w:jc w:val="center"/>
+            </w:pPr>
+            <w:r/>
+            <w:r>
+              <w:rPr>
+                <w:sz w:val="18"/>
+              </w:rPr>
+              <w:t>20.4</w:t>
+            </w:r>
+          </w:p>
+        </w:tc>
+        <w:tc>
+          <w:tcPr>
+            <w:tcW w:type="dxa" w:w="1134"/>
+          </w:tcPr>
+          <w:p>
+            <w:pPr>
+              <w:jc w:val="center"/>
+            </w:pPr>
+            <w:r/>
+            <w:r>
+              <w:rPr>
+                <w:sz w:val="18"/>
+              </w:rPr>
+              <w:t>8 of 8</w:t>
+            </w:r>
+          </w:p>
+        </w:tc>
+      </w:tr>
+      <w:tr>
+        <w:tc>
+          <w:tcPr>
+            <w:tcW w:type="dxa" w:w="1134"/>
+          </w:tcPr>
+          <w:p>
+            <w:pPr>
+              <w:jc w:val="left"/>
+            </w:pPr>
+            <w:r/>
+            <w:r>
+              <w:rPr>
+                <w:sz w:val="18"/>
+              </w:rPr>
+              <w:t>10</w:t>
+            </w:r>
+          </w:p>
+        </w:tc>
+        <w:tc>
+          <w:tcPr>
+            <w:tcW w:type="dxa" w:w="1134"/>
+          </w:tcPr>
+          <w:p>
+            <w:pPr>
+              <w:jc w:val="center"/>
+            </w:pPr>
+            <w:r/>
+            <w:r>
+              <w:rPr>
+                <w:sz w:val="18"/>
+              </w:rPr>
+              <w:t>23.6</w:t>
+            </w:r>
+          </w:p>
+        </w:tc>
+        <w:tc>
+          <w:tcPr>
+            <w:tcW w:type="dxa" w:w="1134"/>
+          </w:tcPr>
+          <w:p>
+            <w:pPr>
+              <w:jc w:val="center"/>
+            </w:pPr>
+            <w:r/>
+            <w:r>
+              <w:rPr>
+                <w:sz w:val="18"/>
+              </w:rPr>
+              <w:t>23.0</w:t>
+            </w:r>
+          </w:p>
+        </w:tc>
+        <w:tc>
+          <w:tcPr>
+            <w:tcW w:type="dxa" w:w="1134"/>
+          </w:tcPr>
+          <w:p>
+            <w:pPr>
+              <w:jc w:val="center"/>
+            </w:pPr>
+            <w:r/>
+            <w:r>
+              <w:rPr>
+                <w:sz w:val="18"/>
+              </w:rPr>
+              <w:t>23.8</w:t>
+            </w:r>
+          </w:p>
+        </w:tc>
+        <w:tc>
+          <w:tcPr>
+            <w:tcW w:type="dxa" w:w="1134"/>
+          </w:tcPr>
+          <w:p>
+            <w:pPr>
+              <w:jc w:val="center"/>
+            </w:pPr>
+            <w:r/>
+            <w:r>
+              <w:rPr>
+                <w:sz w:val="18"/>
+              </w:rPr>
+              <w:t>13.7</w:t>
+            </w:r>
+          </w:p>
+        </w:tc>
+        <w:tc>
+          <w:tcPr>
+            <w:tcW w:type="dxa" w:w="1134"/>
+          </w:tcPr>
+          <w:p>
+            <w:pPr>
+              <w:jc w:val="center"/>
+            </w:pPr>
+            <w:r/>
+            <w:r>
+              <w:rPr>
+                <w:sz w:val="18"/>
+              </w:rPr>
+              <w:t>11.0</w:t>
+            </w:r>
+          </w:p>
+        </w:tc>
+        <w:tc>
+          <w:tcPr>
+            <w:tcW w:type="dxa" w:w="1134"/>
+          </w:tcPr>
+          <w:p>
+            <w:pPr>
+              <w:jc w:val="center"/>
+            </w:pPr>
+            <w:r/>
+            <w:r>
+              <w:rPr>
+                <w:sz w:val="18"/>
+              </w:rPr>
+              <w:t>16.1</w:t>
+            </w:r>
+          </w:p>
+        </w:tc>
+        <w:tc>
+          <w:tcPr>
+            <w:tcW w:type="dxa" w:w="1134"/>
+          </w:tcPr>
+          <w:p>
+            <w:pPr>
+              <w:jc w:val="center"/>
+            </w:pPr>
+            <w:r/>
+            <w:r>
+              <w:rPr>
+                <w:sz w:val="18"/>
+              </w:rPr>
+              <w:t>8 of 8</w:t>
+            </w:r>
+          </w:p>
+        </w:tc>
+      </w:tr>
+      <w:tr>
+        <w:tc>
+          <w:tcPr>
+            <w:tcW w:type="dxa" w:w="1134"/>
+          </w:tcPr>
+          <w:p>
+            <w:pPr>
+              <w:jc w:val="left"/>
+            </w:pPr>
+            <w:r/>
+            <w:r>
+              <w:rPr>
+                <w:sz w:val="18"/>
+              </w:rPr>
+              <w:t>12</w:t>
+            </w:r>
+          </w:p>
+        </w:tc>
+        <w:tc>
+          <w:tcPr>
+            <w:tcW w:type="dxa" w:w="1134"/>
+          </w:tcPr>
+          <w:p>
+            <w:pPr>
+              <w:jc w:val="center"/>
+            </w:pPr>
+            <w:r/>
+            <w:r>
+              <w:rPr>
+                <w:sz w:val="18"/>
+              </w:rPr>
+              <w:t>19.8</w:t>
+            </w:r>
+          </w:p>
+        </w:tc>
+        <w:tc>
+          <w:tcPr>
+            <w:tcW w:type="dxa" w:w="1134"/>
+          </w:tcPr>
+          <w:p>
+            <w:pPr>
+              <w:jc w:val="center"/>
+            </w:pPr>
+            <w:r/>
+            <w:r>
+              <w:rPr>
+                <w:sz w:val="18"/>
+              </w:rPr>
+              <w:t>19.2</w:t>
+            </w:r>
+          </w:p>
+        </w:tc>
+        <w:tc>
+          <w:tcPr>
+            <w:tcW w:type="dxa" w:w="1134"/>
+          </w:tcPr>
+          <w:p>
+            <w:pPr>
+              <w:jc w:val="center"/>
+            </w:pPr>
+            <w:r/>
+            <w:r>
+              <w:rPr>
+                <w:sz w:val="18"/>
+              </w:rPr>
+              <w:t>20.3</w:t>
+            </w:r>
+          </w:p>
+        </w:tc>
+        <w:tc>
+          <w:tcPr>
+            <w:tcW w:type="dxa" w:w="1134"/>
+          </w:tcPr>
+          <w:p>
+            <w:pPr>
+              <w:jc w:val="center"/>
+            </w:pPr>
+            <w:r/>
+            <w:r>
+              <w:rPr>
+                <w:sz w:val="18"/>
+              </w:rPr>
+              <w:t>10.7</w:t>
+            </w:r>
+          </w:p>
+        </w:tc>
+        <w:tc>
+          <w:tcPr>
+            <w:tcW w:type="dxa" w:w="1134"/>
+          </w:tcPr>
+          <w:p>
+            <w:pPr>
+              <w:jc w:val="center"/>
+            </w:pPr>
+            <w:r/>
+            <w:r>
+              <w:rPr>
+                <w:sz w:val="18"/>
+              </w:rPr>
+              <w:t>8.0</w:t>
+            </w:r>
+          </w:p>
+        </w:tc>
+        <w:tc>
+          <w:tcPr>
+            <w:tcW w:type="dxa" w:w="1134"/>
+          </w:tcPr>
+          <w:p>
+            <w:pPr>
+              <w:jc w:val="center"/>
+            </w:pPr>
+            <w:r/>
+            <w:r>
+              <w:rPr>
+                <w:sz w:val="18"/>
+              </w:rPr>
+              <w:t>13.3</w:t>
+            </w:r>
+          </w:p>
+        </w:tc>
+        <w:tc>
+          <w:tcPr>
+            <w:tcW w:type="dxa" w:w="1134"/>
+          </w:tcPr>
+          <w:p>
+            <w:pPr>
+              <w:jc w:val="center"/>
+            </w:pPr>
+            <w:r/>
+            <w:r>
+              <w:rPr>
+                <w:sz w:val="18"/>
+              </w:rPr>
+              <w:t>8 of 8</w:t>
+            </w:r>
+          </w:p>
+        </w:tc>
+      </w:tr>
+      <w:tr>
+        <w:tc>
+          <w:tcPr>
+            <w:tcW w:type="dxa" w:w="1134"/>
+          </w:tcPr>
+          <w:p>
+            <w:pPr>
+              <w:jc w:val="left"/>
+            </w:pPr>
+            <w:r/>
+            <w:r>
+              <w:rPr>
+                <w:sz w:val="18"/>
+              </w:rPr>
+              <w:t>14</w:t>
+            </w:r>
+          </w:p>
+        </w:tc>
+        <w:tc>
+          <w:tcPr>
+            <w:tcW w:type="dxa" w:w="1134"/>
+          </w:tcPr>
+          <w:p>
+            <w:pPr>
+              <w:jc w:val="center"/>
+            </w:pPr>
+            <w:r/>
+            <w:r>
+              <w:rPr>
+                <w:sz w:val="18"/>
+              </w:rPr>
+              <w:t>17.2</w:t>
+            </w:r>
+          </w:p>
+        </w:tc>
+        <w:tc>
+          <w:tcPr>
+            <w:tcW w:type="dxa" w:w="1134"/>
+          </w:tcPr>
+          <w:p>
+            <w:pPr>
+              <w:jc w:val="center"/>
+            </w:pPr>
+            <w:r/>
+            <w:r>
+              <w:rPr>
+                <w:sz w:val="18"/>
+              </w:rPr>
+              <w:t>16.8</w:t>
+            </w:r>
+          </w:p>
+        </w:tc>
+        <w:tc>
+          <w:tcPr>
+            <w:tcW w:type="dxa" w:w="1134"/>
+          </w:tcPr>
+          <w:p>
+            <w:pPr>
+              <w:jc w:val="center"/>
+            </w:pPr>
+            <w:r/>
+            <w:r>
+              <w:rPr>
+                <w:sz w:val="18"/>
+              </w:rPr>
+              <w:t>17.8</w:t>
+            </w:r>
+          </w:p>
+        </w:tc>
+        <w:tc>
+          <w:tcPr>
+            <w:tcW w:type="dxa" w:w="1134"/>
+          </w:tcPr>
+          <w:p>
+            <w:pPr>
+              <w:jc w:val="center"/>
+            </w:pPr>
+            <w:r/>
+            <w:r>
+              <w:rPr>
+                <w:sz w:val="18"/>
+              </w:rPr>
+              <w:t>8.8</w:t>
+            </w:r>
+          </w:p>
+        </w:tc>
+        <w:tc>
+          <w:tcPr>
+            <w:tcW w:type="dxa" w:w="1134"/>
+          </w:tcPr>
+          <w:p>
+            <w:pPr>
+              <w:jc w:val="center"/>
+            </w:pPr>
+            <w:r/>
+            <w:r>
+              <w:rPr>
+                <w:sz w:val="18"/>
+              </w:rPr>
+              <w:t>5.8</w:t>
+            </w:r>
+          </w:p>
+        </w:tc>
+        <w:tc>
+          <w:tcPr>
+            <w:tcW w:type="dxa" w:w="1134"/>
+          </w:tcPr>
+          <w:p>
+            <w:pPr>
+              <w:jc w:val="center"/>
+            </w:pPr>
+            <w:r/>
+            <w:r>
+              <w:rPr>
+                <w:sz w:val="18"/>
+              </w:rPr>
+              <w:t>10.8</w:t>
+            </w:r>
+          </w:p>
+        </w:tc>
+        <w:tc>
+          <w:tcPr>
+            <w:tcW w:type="dxa" w:w="1134"/>
+          </w:tcPr>
+          <w:p>
+            <w:pPr>
+              <w:jc w:val="center"/>
+            </w:pPr>
+            <w:r/>
+            <w:r>
+              <w:rPr>
+                <w:sz w:val="18"/>
+              </w:rPr>
+              <w:t>8 of 8</w:t>
+            </w:r>
+          </w:p>
+        </w:tc>
+      </w:tr>
+    </w:tbl>
+    <w:p>
+      <w:pPr>
+        <w:spacing w:after="80"/>
+      </w:pPr>
+    </w:p>
+    <w:p>
+      <w:pPr>
+        <w:spacing w:after="160" w:line="276" w:lineRule="auto"/>
+      </w:pPr>
+      <w:r>
+        <w:rPr>
+          <w:b w:val="0"/>
+          <w:i/>
+          <w:sz w:val="20"/>
+        </w:rPr>
+        <w:t>Reductions are computed per image and then summarized; a positive value means that the Adaptive strategy was faster.</w:t>
+      </w:r>
     </w:p>
     <w:sectPr>
       <w:pgSz w:w="11906" w:h="16838"/>

</xml_diff>

<commit_message>
Chapter 4 draft: keep only the LBG Equal/Adaptive figure (Figure 4.6)
Co-Authored-By: Claude Sonnet 5.5 <noreply@anthropic.com>
Claude-Session: https://claude.ai/code/session_01T6gEewJ8YaCdmnsfS34RJd
</commit_message>
<xml_diff>
--- a/results/Chapter_4_final.docx
+++ b/results/Chapter_4_final.docx
@@ -12162,59 +12162,6 @@
           <w:i w:val="0"/>
         </w:rPr>
         <w:t>The Adaptive strategy reduced the LBG time of all eight images at every process count from P = 8 to P = 14. The mean reduction over the eight images was 28.3% at P = 8, and decreased to 23.6%, 19.8%, and 17.2% at P = 10, 12, and 14, respectively. The reduction varied little among the images (Appendix A, Table A.6); for example, it ranged from 28.0% to 28.5% at P = 8 and from 16.8% to 17.8% at P = 14.</w:t>
-      </w:r>
-    </w:p>
-    <w:p>
-      <w:pPr>
-        <w:jc w:val="center"/>
-      </w:pPr>
-      <w:r>
-        <w:drawing>
-          <wp:inline xmlns:a="http://schemas.openxmlformats.org/drawingml/2006/main" xmlns:pic="http://schemas.openxmlformats.org/drawingml/2006/picture">
-            <wp:extent cx="5486400" cy="2514600"/>
-            <wp:docPr id="6" name="Picture 6"/>
-            <wp:cNvGraphicFramePr>
-              <a:graphicFrameLocks noChangeAspect="1"/>
-            </wp:cNvGraphicFramePr>
-            <a:graphic>
-              <a:graphicData uri="http://schemas.openxmlformats.org/drawingml/2006/picture">
-                <pic:pic>
-                  <pic:nvPicPr>
-                    <pic:cNvPr id="0" name="fig_ea_total.png"/>
-                    <pic:cNvPicPr/>
-                  </pic:nvPicPr>
-                  <pic:blipFill>
-                    <a:blip r:embed="rId14"/>
-                    <a:stretch>
-                      <a:fillRect/>
-                    </a:stretch>
-                  </pic:blipFill>
-                  <pic:spPr>
-                    <a:xfrm>
-                      <a:off x="0" y="0"/>
-                      <a:ext cx="5486400" cy="2514600"/>
-                    </a:xfrm>
-                    <a:prstGeom prst="rect"/>
-                  </pic:spPr>
-                </pic:pic>
-              </a:graphicData>
-            </a:graphic>
-          </wp:inline>
-        </w:drawing>
-      </w:r>
-    </w:p>
-    <w:p>
-      <w:pPr>
-        <w:spacing w:after="200" w:line="276" w:lineRule="auto"/>
-        <w:jc w:val="center"/>
-      </w:pPr>
-      <w:r>
-        <w:rPr>
-          <w:b w:val="0"/>
-          <w:i/>
-          <w:sz w:val="22"/>
-        </w:rPr>
-        <w:t>Figure 4.7. Mean total execution time of the Equal and Adaptive strategies for the grayscale and color images. The shaded region marks the P-core-only range (P ≤ 6).</w:t>
       </w:r>
     </w:p>
     <w:p>

</xml_diff>

<commit_message>
Chapter 4 draft: remove appendix reference from Section 4.6 (numbers cited from Tables 4.16/4.17); drop Table A.6
Co-Authored-By: Claude Sonnet 5.5 <noreply@anthropic.com>
Claude-Session: https://claude.ai/code/session_01T6gEewJ8YaCdmnsfS34RJd
</commit_message>
<xml_diff>
--- a/results/Chapter_4_final.docx
+++ b/results/Chapter_4_final.docx
@@ -12161,7 +12161,7 @@
           <w:b w:val="0"/>
           <w:i w:val="0"/>
         </w:rPr>
-        <w:t>The Adaptive strategy reduced the LBG time of all eight images at every process count from P = 8 to P = 14. The mean reduction over the eight images was 28.3% at P = 8, and decreased to 23.6%, 19.8%, and 17.2% at P = 10, 12, and 14, respectively. The reduction varied little among the images (Appendix A, Table A.6); for example, it ranged from 28.0% to 28.5% at P = 8 and from 16.8% to 17.8% at P = 14.</w:t>
+        <w:t>The Adaptive strategy reduced the LBG time of all eight images at every process count from P = 8 to P = 14. The mean reduction over the eight images was 28.3% at P = 8, and decreased to 23.6%, 19.8%, and 17.2% at P = 10, 12, and 14, respectively. The reduction varied little among the images; for example, it ranged from 28.0% to 28.5% at P = 8 and from 16.8% to 17.8% at P = 14.</w:t>
       </w:r>
     </w:p>
     <w:p>
@@ -12174,7 +12174,7 @@
           <w:b w:val="0"/>
           <w:i w:val="0"/>
         </w:rPr>
-        <w:t>For P = 2, 4, and 6, the total times of the two strategies were nearly identical, with the Adaptive strategy slightly slower on average (by at most 0.9%), which is consistent with the small cost of the speed calibration, included in the total time of the Adaptive strategy. From P = 8 to P = 14, the Adaptive strategy reduced the total time of all eight images. The mean reduction over the eight images was 17.9% at P = 8, 13.7% at P = 10, 10.7% at P = 12, and 8.8% at P = 14. These reductions are smaller than the corresponding LBG reductions because the complete program includes stages that are not accelerated by the workload distribution. The reduction was larger for the color images than for the grayscale images: at P = 8 it was 20.3% and 15.6%, respectively, and at P = 14 it was 10.5% and 7.0%. This is consistent with the larger share of the LBG stage in the sequential time of the color images (Section 4.4). The calibration cost was included in the total time of the Adaptive strategy, and the reduction nevertheless remained positive for every image.</w:t>
+        <w:t>For P = 2, 4, and 6, the total times of the two strategies were nearly identical, with the Adaptive strategy slightly slower on average (by 0.1% to 0.9%, Tables 4.16 and 4.17), which is consistent with the small cost of the speed calibration, included in the total time of the Adaptive strategy. From P = 8 to P = 14, the Adaptive strategy reduced the total time of all eight images. The mean reduction over the eight images was 17.9% at P = 8, 13.7% at P = 10, 10.7% at P = 12, and 8.8% at P = 14. These reductions are smaller than the corresponding LBG reductions because the complete program includes stages that are not accelerated by the workload distribution. The reduction was larger for the color images than for the grayscale images: at P = 8 it was 20.3% and 15.6%, respectively, and at P = 14 it was 10.5% and 7.0% (Tables 4.17 and 4.16). This is consistent with the larger share of the LBG stage in the sequential time of the color images (Section 4.4). The calibration cost was included in the total time of the Adaptive strategy, and the reduction nevertheless remained positive for every image.</w:t>
       </w:r>
     </w:p>
     <w:p>
@@ -20532,1175 +20532,6 @@
       <w:pPr>
         <w:spacing w:after="80"/>
       </w:pPr>
-    </w:p>
-    <w:p>
-      <w:pPr>
-        <w:pStyle w:val="Heading3"/>
-      </w:pPr>
-      <w:r>
-        <w:t>A.6 Summary of the reductions achieved by the Adaptive strategy</w:t>
-      </w:r>
-    </w:p>
-    <w:p>
-      <w:pPr>
-        <w:keepNext/>
-        <w:spacing w:after="60" w:line="276" w:lineRule="auto"/>
-      </w:pPr>
-      <w:r>
-        <w:rPr>
-          <w:b/>
-          <w:i w:val="0"/>
-        </w:rPr>
-        <w:t>Table A.6. Mean, minimum, and maximum reduction (%) of the LBG time and of the total time achieved by the Adaptive strategy over the eight images.</w:t>
-      </w:r>
-    </w:p>
-    <w:tbl>
-      <w:tblPr>
-        <w:tblStyle w:val="TableGrid"/>
-        <w:tblW w:type="auto" w:w="0"/>
-        <w:jc w:val="center"/>
-        <w:tblLook w:firstColumn="1" w:firstRow="1" w:lastColumn="0" w:lastRow="0" w:noHBand="0" w:noVBand="1" w:val="04A0"/>
-      </w:tblPr>
-      <w:tblGrid>
-        <w:gridCol w:w="1134"/>
-        <w:gridCol w:w="1134"/>
-        <w:gridCol w:w="1134"/>
-        <w:gridCol w:w="1134"/>
-        <w:gridCol w:w="1134"/>
-        <w:gridCol w:w="1134"/>
-        <w:gridCol w:w="1134"/>
-        <w:gridCol w:w="1134"/>
-      </w:tblGrid>
-      <w:tr>
-        <w:tc>
-          <w:tcPr>
-            <w:tcW w:type="dxa" w:w="1134"/>
-          </w:tcPr>
-          <w:p>
-            <w:pPr>
-              <w:jc w:val="center"/>
-            </w:pPr>
-            <w:r/>
-            <w:r>
-              <w:rPr>
-                <w:b/>
-                <w:sz w:val="18"/>
-              </w:rPr>
-              <w:t>P</w:t>
-            </w:r>
-          </w:p>
-        </w:tc>
-        <w:tc>
-          <w:tcPr>
-            <w:tcW w:type="dxa" w:w="1134"/>
-          </w:tcPr>
-          <w:p>
-            <w:pPr>
-              <w:jc w:val="center"/>
-            </w:pPr>
-            <w:r/>
-            <w:r>
-              <w:rPr>
-                <w:b/>
-                <w:sz w:val="18"/>
-              </w:rPr>
-              <w:t>LBG mean</w:t>
-            </w:r>
-          </w:p>
-        </w:tc>
-        <w:tc>
-          <w:tcPr>
-            <w:tcW w:type="dxa" w:w="1134"/>
-          </w:tcPr>
-          <w:p>
-            <w:pPr>
-              <w:jc w:val="center"/>
-            </w:pPr>
-            <w:r/>
-            <w:r>
-              <w:rPr>
-                <w:b/>
-                <w:sz w:val="18"/>
-              </w:rPr>
-              <w:t>LBG min</w:t>
-            </w:r>
-          </w:p>
-        </w:tc>
-        <w:tc>
-          <w:tcPr>
-            <w:tcW w:type="dxa" w:w="1134"/>
-          </w:tcPr>
-          <w:p>
-            <w:pPr>
-              <w:jc w:val="center"/>
-            </w:pPr>
-            <w:r/>
-            <w:r>
-              <w:rPr>
-                <w:b/>
-                <w:sz w:val="18"/>
-              </w:rPr>
-              <w:t>LBG max</w:t>
-            </w:r>
-          </w:p>
-        </w:tc>
-        <w:tc>
-          <w:tcPr>
-            <w:tcW w:type="dxa" w:w="1134"/>
-          </w:tcPr>
-          <w:p>
-            <w:pPr>
-              <w:jc w:val="center"/>
-            </w:pPr>
-            <w:r/>
-            <w:r>
-              <w:rPr>
-                <w:b/>
-                <w:sz w:val="18"/>
-              </w:rPr>
-              <w:t>Total mean</w:t>
-            </w:r>
-          </w:p>
-        </w:tc>
-        <w:tc>
-          <w:tcPr>
-            <w:tcW w:type="dxa" w:w="1134"/>
-          </w:tcPr>
-          <w:p>
-            <w:pPr>
-              <w:jc w:val="center"/>
-            </w:pPr>
-            <w:r/>
-            <w:r>
-              <w:rPr>
-                <w:b/>
-                <w:sz w:val="18"/>
-              </w:rPr>
-              <w:t>Total min</w:t>
-            </w:r>
-          </w:p>
-        </w:tc>
-        <w:tc>
-          <w:tcPr>
-            <w:tcW w:type="dxa" w:w="1134"/>
-          </w:tcPr>
-          <w:p>
-            <w:pPr>
-              <w:jc w:val="center"/>
-            </w:pPr>
-            <w:r/>
-            <w:r>
-              <w:rPr>
-                <w:b/>
-                <w:sz w:val="18"/>
-              </w:rPr>
-              <w:t>Total max</w:t>
-            </w:r>
-          </w:p>
-        </w:tc>
-        <w:tc>
-          <w:tcPr>
-            <w:tcW w:type="dxa" w:w="1134"/>
-          </w:tcPr>
-          <w:p>
-            <w:pPr>
-              <w:jc w:val="center"/>
-            </w:pPr>
-            <w:r/>
-            <w:r>
-              <w:rPr>
-                <w:b/>
-                <w:sz w:val="18"/>
-              </w:rPr>
-              <w:t>Images with total reduction &gt; 1%</w:t>
-            </w:r>
-          </w:p>
-        </w:tc>
-      </w:tr>
-      <w:tr>
-        <w:tc>
-          <w:tcPr>
-            <w:tcW w:type="dxa" w:w="1134"/>
-          </w:tcPr>
-          <w:p>
-            <w:pPr>
-              <w:jc w:val="left"/>
-            </w:pPr>
-            <w:r/>
-            <w:r>
-              <w:rPr>
-                <w:sz w:val="18"/>
-              </w:rPr>
-              <w:t>2</w:t>
-            </w:r>
-          </w:p>
-        </w:tc>
-        <w:tc>
-          <w:tcPr>
-            <w:tcW w:type="dxa" w:w="1134"/>
-          </w:tcPr>
-          <w:p>
-            <w:pPr>
-              <w:jc w:val="center"/>
-            </w:pPr>
-            <w:r/>
-            <w:r>
-              <w:rPr>
-                <w:sz w:val="18"/>
-              </w:rPr>
-              <w:t>-0.1</w:t>
-            </w:r>
-          </w:p>
-        </w:tc>
-        <w:tc>
-          <w:tcPr>
-            <w:tcW w:type="dxa" w:w="1134"/>
-          </w:tcPr>
-          <w:p>
-            <w:pPr>
-              <w:jc w:val="center"/>
-            </w:pPr>
-            <w:r/>
-            <w:r>
-              <w:rPr>
-                <w:sz w:val="18"/>
-              </w:rPr>
-              <w:t>-0.2</w:t>
-            </w:r>
-          </w:p>
-        </w:tc>
-        <w:tc>
-          <w:tcPr>
-            <w:tcW w:type="dxa" w:w="1134"/>
-          </w:tcPr>
-          <w:p>
-            <w:pPr>
-              <w:jc w:val="center"/>
-            </w:pPr>
-            <w:r/>
-            <w:r>
-              <w:rPr>
-                <w:sz w:val="18"/>
-              </w:rPr>
-              <w:t>0.1</w:t>
-            </w:r>
-          </w:p>
-        </w:tc>
-        <w:tc>
-          <w:tcPr>
-            <w:tcW w:type="dxa" w:w="1134"/>
-          </w:tcPr>
-          <w:p>
-            <w:pPr>
-              <w:jc w:val="center"/>
-            </w:pPr>
-            <w:r/>
-            <w:r>
-              <w:rPr>
-                <w:sz w:val="18"/>
-              </w:rPr>
-              <w:t>-0.3</w:t>
-            </w:r>
-          </w:p>
-        </w:tc>
-        <w:tc>
-          <w:tcPr>
-            <w:tcW w:type="dxa" w:w="1134"/>
-          </w:tcPr>
-          <w:p>
-            <w:pPr>
-              <w:jc w:val="center"/>
-            </w:pPr>
-            <w:r/>
-            <w:r>
-              <w:rPr>
-                <w:sz w:val="18"/>
-              </w:rPr>
-              <w:t>-0.6</w:t>
-            </w:r>
-          </w:p>
-        </w:tc>
-        <w:tc>
-          <w:tcPr>
-            <w:tcW w:type="dxa" w:w="1134"/>
-          </w:tcPr>
-          <w:p>
-            <w:pPr>
-              <w:jc w:val="center"/>
-            </w:pPr>
-            <w:r/>
-            <w:r>
-              <w:rPr>
-                <w:sz w:val="18"/>
-              </w:rPr>
-              <w:t>0.0</w:t>
-            </w:r>
-          </w:p>
-        </w:tc>
-        <w:tc>
-          <w:tcPr>
-            <w:tcW w:type="dxa" w:w="1134"/>
-          </w:tcPr>
-          <w:p>
-            <w:pPr>
-              <w:jc w:val="center"/>
-            </w:pPr>
-            <w:r/>
-            <w:r>
-              <w:rPr>
-                <w:sz w:val="18"/>
-              </w:rPr>
-              <w:t>0 of 8</w:t>
-            </w:r>
-          </w:p>
-        </w:tc>
-      </w:tr>
-      <w:tr>
-        <w:tc>
-          <w:tcPr>
-            <w:tcW w:type="dxa" w:w="1134"/>
-          </w:tcPr>
-          <w:p>
-            <w:pPr>
-              <w:jc w:val="left"/>
-            </w:pPr>
-            <w:r/>
-            <w:r>
-              <w:rPr>
-                <w:sz w:val="18"/>
-              </w:rPr>
-              <w:t>4</w:t>
-            </w:r>
-          </w:p>
-        </w:tc>
-        <w:tc>
-          <w:tcPr>
-            <w:tcW w:type="dxa" w:w="1134"/>
-          </w:tcPr>
-          <w:p>
-            <w:pPr>
-              <w:jc w:val="center"/>
-            </w:pPr>
-            <w:r/>
-            <w:r>
-              <w:rPr>
-                <w:sz w:val="18"/>
-              </w:rPr>
-              <w:t>-0.2</w:t>
-            </w:r>
-          </w:p>
-        </w:tc>
-        <w:tc>
-          <w:tcPr>
-            <w:tcW w:type="dxa" w:w="1134"/>
-          </w:tcPr>
-          <w:p>
-            <w:pPr>
-              <w:jc w:val="center"/>
-            </w:pPr>
-            <w:r/>
-            <w:r>
-              <w:rPr>
-                <w:sz w:val="18"/>
-              </w:rPr>
-              <w:t>-1.3</w:t>
-            </w:r>
-          </w:p>
-        </w:tc>
-        <w:tc>
-          <w:tcPr>
-            <w:tcW w:type="dxa" w:w="1134"/>
-          </w:tcPr>
-          <w:p>
-            <w:pPr>
-              <w:jc w:val="center"/>
-            </w:pPr>
-            <w:r/>
-            <w:r>
-              <w:rPr>
-                <w:sz w:val="18"/>
-              </w:rPr>
-              <w:t>0.5</w:t>
-            </w:r>
-          </w:p>
-        </w:tc>
-        <w:tc>
-          <w:tcPr>
-            <w:tcW w:type="dxa" w:w="1134"/>
-          </w:tcPr>
-          <w:p>
-            <w:pPr>
-              <w:jc w:val="center"/>
-            </w:pPr>
-            <w:r/>
-            <w:r>
-              <w:rPr>
-                <w:sz w:val="18"/>
-              </w:rPr>
-              <w:t>-0.6</w:t>
-            </w:r>
-          </w:p>
-        </w:tc>
-        <w:tc>
-          <w:tcPr>
-            <w:tcW w:type="dxa" w:w="1134"/>
-          </w:tcPr>
-          <w:p>
-            <w:pPr>
-              <w:jc w:val="center"/>
-            </w:pPr>
-            <w:r/>
-            <w:r>
-              <w:rPr>
-                <w:sz w:val="18"/>
-              </w:rPr>
-              <w:t>-1.1</w:t>
-            </w:r>
-          </w:p>
-        </w:tc>
-        <w:tc>
-          <w:tcPr>
-            <w:tcW w:type="dxa" w:w="1134"/>
-          </w:tcPr>
-          <w:p>
-            <w:pPr>
-              <w:jc w:val="center"/>
-            </w:pPr>
-            <w:r/>
-            <w:r>
-              <w:rPr>
-                <w:sz w:val="18"/>
-              </w:rPr>
-              <w:t>0.0</w:t>
-            </w:r>
-          </w:p>
-        </w:tc>
-        <w:tc>
-          <w:tcPr>
-            <w:tcW w:type="dxa" w:w="1134"/>
-          </w:tcPr>
-          <w:p>
-            <w:pPr>
-              <w:jc w:val="center"/>
-            </w:pPr>
-            <w:r/>
-            <w:r>
-              <w:rPr>
-                <w:sz w:val="18"/>
-              </w:rPr>
-              <w:t>0 of 8</w:t>
-            </w:r>
-          </w:p>
-        </w:tc>
-      </w:tr>
-      <w:tr>
-        <w:tc>
-          <w:tcPr>
-            <w:tcW w:type="dxa" w:w="1134"/>
-          </w:tcPr>
-          <w:p>
-            <w:pPr>
-              <w:jc w:val="left"/>
-            </w:pPr>
-            <w:r/>
-            <w:r>
-              <w:rPr>
-                <w:sz w:val="18"/>
-              </w:rPr>
-              <w:t>6</w:t>
-            </w:r>
-          </w:p>
-        </w:tc>
-        <w:tc>
-          <w:tcPr>
-            <w:tcW w:type="dxa" w:w="1134"/>
-          </w:tcPr>
-          <w:p>
-            <w:pPr>
-              <w:jc w:val="center"/>
-            </w:pPr>
-            <w:r/>
-            <w:r>
-              <w:rPr>
-                <w:sz w:val="18"/>
-              </w:rPr>
-              <w:t>-0.1</w:t>
-            </w:r>
-          </w:p>
-        </w:tc>
-        <w:tc>
-          <w:tcPr>
-            <w:tcW w:type="dxa" w:w="1134"/>
-          </w:tcPr>
-          <w:p>
-            <w:pPr>
-              <w:jc w:val="center"/>
-            </w:pPr>
-            <w:r/>
-            <w:r>
-              <w:rPr>
-                <w:sz w:val="18"/>
-              </w:rPr>
-              <w:t>-0.8</w:t>
-            </w:r>
-          </w:p>
-        </w:tc>
-        <w:tc>
-          <w:tcPr>
-            <w:tcW w:type="dxa" w:w="1134"/>
-          </w:tcPr>
-          <w:p>
-            <w:pPr>
-              <w:jc w:val="center"/>
-            </w:pPr>
-            <w:r/>
-            <w:r>
-              <w:rPr>
-                <w:sz w:val="18"/>
-              </w:rPr>
-              <w:t>0.5</w:t>
-            </w:r>
-          </w:p>
-        </w:tc>
-        <w:tc>
-          <w:tcPr>
-            <w:tcW w:type="dxa" w:w="1134"/>
-          </w:tcPr>
-          <w:p>
-            <w:pPr>
-              <w:jc w:val="center"/>
-            </w:pPr>
-            <w:r/>
-            <w:r>
-              <w:rPr>
-                <w:sz w:val="18"/>
-              </w:rPr>
-              <w:t>-0.6</w:t>
-            </w:r>
-          </w:p>
-        </w:tc>
-        <w:tc>
-          <w:tcPr>
-            <w:tcW w:type="dxa" w:w="1134"/>
-          </w:tcPr>
-          <w:p>
-            <w:pPr>
-              <w:jc w:val="center"/>
-            </w:pPr>
-            <w:r/>
-            <w:r>
-              <w:rPr>
-                <w:sz w:val="18"/>
-              </w:rPr>
-              <w:t>-1.2</w:t>
-            </w:r>
-          </w:p>
-        </w:tc>
-        <w:tc>
-          <w:tcPr>
-            <w:tcW w:type="dxa" w:w="1134"/>
-          </w:tcPr>
-          <w:p>
-            <w:pPr>
-              <w:jc w:val="center"/>
-            </w:pPr>
-            <w:r/>
-            <w:r>
-              <w:rPr>
-                <w:sz w:val="18"/>
-              </w:rPr>
-              <w:t>0.0</w:t>
-            </w:r>
-          </w:p>
-        </w:tc>
-        <w:tc>
-          <w:tcPr>
-            <w:tcW w:type="dxa" w:w="1134"/>
-          </w:tcPr>
-          <w:p>
-            <w:pPr>
-              <w:jc w:val="center"/>
-            </w:pPr>
-            <w:r/>
-            <w:r>
-              <w:rPr>
-                <w:sz w:val="18"/>
-              </w:rPr>
-              <w:t>0 of 8</w:t>
-            </w:r>
-          </w:p>
-        </w:tc>
-      </w:tr>
-      <w:tr>
-        <w:tc>
-          <w:tcPr>
-            <w:tcW w:type="dxa" w:w="1134"/>
-          </w:tcPr>
-          <w:p>
-            <w:pPr>
-              <w:jc w:val="left"/>
-            </w:pPr>
-            <w:r/>
-            <w:r>
-              <w:rPr>
-                <w:sz w:val="18"/>
-              </w:rPr>
-              <w:t>8</w:t>
-            </w:r>
-          </w:p>
-        </w:tc>
-        <w:tc>
-          <w:tcPr>
-            <w:tcW w:type="dxa" w:w="1134"/>
-          </w:tcPr>
-          <w:p>
-            <w:pPr>
-              <w:jc w:val="center"/>
-            </w:pPr>
-            <w:r/>
-            <w:r>
-              <w:rPr>
-                <w:sz w:val="18"/>
-              </w:rPr>
-              <w:t>28.3</w:t>
-            </w:r>
-          </w:p>
-        </w:tc>
-        <w:tc>
-          <w:tcPr>
-            <w:tcW w:type="dxa" w:w="1134"/>
-          </w:tcPr>
-          <w:p>
-            <w:pPr>
-              <w:jc w:val="center"/>
-            </w:pPr>
-            <w:r/>
-            <w:r>
-              <w:rPr>
-                <w:sz w:val="18"/>
-              </w:rPr>
-              <w:t>28.0</w:t>
-            </w:r>
-          </w:p>
-        </w:tc>
-        <w:tc>
-          <w:tcPr>
-            <w:tcW w:type="dxa" w:w="1134"/>
-          </w:tcPr>
-          <w:p>
-            <w:pPr>
-              <w:jc w:val="center"/>
-            </w:pPr>
-            <w:r/>
-            <w:r>
-              <w:rPr>
-                <w:sz w:val="18"/>
-              </w:rPr>
-              <w:t>28.5</w:t>
-            </w:r>
-          </w:p>
-        </w:tc>
-        <w:tc>
-          <w:tcPr>
-            <w:tcW w:type="dxa" w:w="1134"/>
-          </w:tcPr>
-          <w:p>
-            <w:pPr>
-              <w:jc w:val="center"/>
-            </w:pPr>
-            <w:r/>
-            <w:r>
-              <w:rPr>
-                <w:sz w:val="18"/>
-              </w:rPr>
-              <w:t>17.9</w:t>
-            </w:r>
-          </w:p>
-        </w:tc>
-        <w:tc>
-          <w:tcPr>
-            <w:tcW w:type="dxa" w:w="1134"/>
-          </w:tcPr>
-          <w:p>
-            <w:pPr>
-              <w:jc w:val="center"/>
-            </w:pPr>
-            <w:r/>
-            <w:r>
-              <w:rPr>
-                <w:sz w:val="18"/>
-              </w:rPr>
-              <w:t>14.9</w:t>
-            </w:r>
-          </w:p>
-        </w:tc>
-        <w:tc>
-          <w:tcPr>
-            <w:tcW w:type="dxa" w:w="1134"/>
-          </w:tcPr>
-          <w:p>
-            <w:pPr>
-              <w:jc w:val="center"/>
-            </w:pPr>
-            <w:r/>
-            <w:r>
-              <w:rPr>
-                <w:sz w:val="18"/>
-              </w:rPr>
-              <w:t>20.4</w:t>
-            </w:r>
-          </w:p>
-        </w:tc>
-        <w:tc>
-          <w:tcPr>
-            <w:tcW w:type="dxa" w:w="1134"/>
-          </w:tcPr>
-          <w:p>
-            <w:pPr>
-              <w:jc w:val="center"/>
-            </w:pPr>
-            <w:r/>
-            <w:r>
-              <w:rPr>
-                <w:sz w:val="18"/>
-              </w:rPr>
-              <w:t>8 of 8</w:t>
-            </w:r>
-          </w:p>
-        </w:tc>
-      </w:tr>
-      <w:tr>
-        <w:tc>
-          <w:tcPr>
-            <w:tcW w:type="dxa" w:w="1134"/>
-          </w:tcPr>
-          <w:p>
-            <w:pPr>
-              <w:jc w:val="left"/>
-            </w:pPr>
-            <w:r/>
-            <w:r>
-              <w:rPr>
-                <w:sz w:val="18"/>
-              </w:rPr>
-              <w:t>10</w:t>
-            </w:r>
-          </w:p>
-        </w:tc>
-        <w:tc>
-          <w:tcPr>
-            <w:tcW w:type="dxa" w:w="1134"/>
-          </w:tcPr>
-          <w:p>
-            <w:pPr>
-              <w:jc w:val="center"/>
-            </w:pPr>
-            <w:r/>
-            <w:r>
-              <w:rPr>
-                <w:sz w:val="18"/>
-              </w:rPr>
-              <w:t>23.6</w:t>
-            </w:r>
-          </w:p>
-        </w:tc>
-        <w:tc>
-          <w:tcPr>
-            <w:tcW w:type="dxa" w:w="1134"/>
-          </w:tcPr>
-          <w:p>
-            <w:pPr>
-              <w:jc w:val="center"/>
-            </w:pPr>
-            <w:r/>
-            <w:r>
-              <w:rPr>
-                <w:sz w:val="18"/>
-              </w:rPr>
-              <w:t>23.0</w:t>
-            </w:r>
-          </w:p>
-        </w:tc>
-        <w:tc>
-          <w:tcPr>
-            <w:tcW w:type="dxa" w:w="1134"/>
-          </w:tcPr>
-          <w:p>
-            <w:pPr>
-              <w:jc w:val="center"/>
-            </w:pPr>
-            <w:r/>
-            <w:r>
-              <w:rPr>
-                <w:sz w:val="18"/>
-              </w:rPr>
-              <w:t>23.8</w:t>
-            </w:r>
-          </w:p>
-        </w:tc>
-        <w:tc>
-          <w:tcPr>
-            <w:tcW w:type="dxa" w:w="1134"/>
-          </w:tcPr>
-          <w:p>
-            <w:pPr>
-              <w:jc w:val="center"/>
-            </w:pPr>
-            <w:r/>
-            <w:r>
-              <w:rPr>
-                <w:sz w:val="18"/>
-              </w:rPr>
-              <w:t>13.7</w:t>
-            </w:r>
-          </w:p>
-        </w:tc>
-        <w:tc>
-          <w:tcPr>
-            <w:tcW w:type="dxa" w:w="1134"/>
-          </w:tcPr>
-          <w:p>
-            <w:pPr>
-              <w:jc w:val="center"/>
-            </w:pPr>
-            <w:r/>
-            <w:r>
-              <w:rPr>
-                <w:sz w:val="18"/>
-              </w:rPr>
-              <w:t>11.0</w:t>
-            </w:r>
-          </w:p>
-        </w:tc>
-        <w:tc>
-          <w:tcPr>
-            <w:tcW w:type="dxa" w:w="1134"/>
-          </w:tcPr>
-          <w:p>
-            <w:pPr>
-              <w:jc w:val="center"/>
-            </w:pPr>
-            <w:r/>
-            <w:r>
-              <w:rPr>
-                <w:sz w:val="18"/>
-              </w:rPr>
-              <w:t>16.1</w:t>
-            </w:r>
-          </w:p>
-        </w:tc>
-        <w:tc>
-          <w:tcPr>
-            <w:tcW w:type="dxa" w:w="1134"/>
-          </w:tcPr>
-          <w:p>
-            <w:pPr>
-              <w:jc w:val="center"/>
-            </w:pPr>
-            <w:r/>
-            <w:r>
-              <w:rPr>
-                <w:sz w:val="18"/>
-              </w:rPr>
-              <w:t>8 of 8</w:t>
-            </w:r>
-          </w:p>
-        </w:tc>
-      </w:tr>
-      <w:tr>
-        <w:tc>
-          <w:tcPr>
-            <w:tcW w:type="dxa" w:w="1134"/>
-          </w:tcPr>
-          <w:p>
-            <w:pPr>
-              <w:jc w:val="left"/>
-            </w:pPr>
-            <w:r/>
-            <w:r>
-              <w:rPr>
-                <w:sz w:val="18"/>
-              </w:rPr>
-              <w:t>12</w:t>
-            </w:r>
-          </w:p>
-        </w:tc>
-        <w:tc>
-          <w:tcPr>
-            <w:tcW w:type="dxa" w:w="1134"/>
-          </w:tcPr>
-          <w:p>
-            <w:pPr>
-              <w:jc w:val="center"/>
-            </w:pPr>
-            <w:r/>
-            <w:r>
-              <w:rPr>
-                <w:sz w:val="18"/>
-              </w:rPr>
-              <w:t>19.8</w:t>
-            </w:r>
-          </w:p>
-        </w:tc>
-        <w:tc>
-          <w:tcPr>
-            <w:tcW w:type="dxa" w:w="1134"/>
-          </w:tcPr>
-          <w:p>
-            <w:pPr>
-              <w:jc w:val="center"/>
-            </w:pPr>
-            <w:r/>
-            <w:r>
-              <w:rPr>
-                <w:sz w:val="18"/>
-              </w:rPr>
-              <w:t>19.2</w:t>
-            </w:r>
-          </w:p>
-        </w:tc>
-        <w:tc>
-          <w:tcPr>
-            <w:tcW w:type="dxa" w:w="1134"/>
-          </w:tcPr>
-          <w:p>
-            <w:pPr>
-              <w:jc w:val="center"/>
-            </w:pPr>
-            <w:r/>
-            <w:r>
-              <w:rPr>
-                <w:sz w:val="18"/>
-              </w:rPr>
-              <w:t>20.3</w:t>
-            </w:r>
-          </w:p>
-        </w:tc>
-        <w:tc>
-          <w:tcPr>
-            <w:tcW w:type="dxa" w:w="1134"/>
-          </w:tcPr>
-          <w:p>
-            <w:pPr>
-              <w:jc w:val="center"/>
-            </w:pPr>
-            <w:r/>
-            <w:r>
-              <w:rPr>
-                <w:sz w:val="18"/>
-              </w:rPr>
-              <w:t>10.7</w:t>
-            </w:r>
-          </w:p>
-        </w:tc>
-        <w:tc>
-          <w:tcPr>
-            <w:tcW w:type="dxa" w:w="1134"/>
-          </w:tcPr>
-          <w:p>
-            <w:pPr>
-              <w:jc w:val="center"/>
-            </w:pPr>
-            <w:r/>
-            <w:r>
-              <w:rPr>
-                <w:sz w:val="18"/>
-              </w:rPr>
-              <w:t>8.0</w:t>
-            </w:r>
-          </w:p>
-        </w:tc>
-        <w:tc>
-          <w:tcPr>
-            <w:tcW w:type="dxa" w:w="1134"/>
-          </w:tcPr>
-          <w:p>
-            <w:pPr>
-              <w:jc w:val="center"/>
-            </w:pPr>
-            <w:r/>
-            <w:r>
-              <w:rPr>
-                <w:sz w:val="18"/>
-              </w:rPr>
-              <w:t>13.3</w:t>
-            </w:r>
-          </w:p>
-        </w:tc>
-        <w:tc>
-          <w:tcPr>
-            <w:tcW w:type="dxa" w:w="1134"/>
-          </w:tcPr>
-          <w:p>
-            <w:pPr>
-              <w:jc w:val="center"/>
-            </w:pPr>
-            <w:r/>
-            <w:r>
-              <w:rPr>
-                <w:sz w:val="18"/>
-              </w:rPr>
-              <w:t>8 of 8</w:t>
-            </w:r>
-          </w:p>
-        </w:tc>
-      </w:tr>
-      <w:tr>
-        <w:tc>
-          <w:tcPr>
-            <w:tcW w:type="dxa" w:w="1134"/>
-          </w:tcPr>
-          <w:p>
-            <w:pPr>
-              <w:jc w:val="left"/>
-            </w:pPr>
-            <w:r/>
-            <w:r>
-              <w:rPr>
-                <w:sz w:val="18"/>
-              </w:rPr>
-              <w:t>14</w:t>
-            </w:r>
-          </w:p>
-        </w:tc>
-        <w:tc>
-          <w:tcPr>
-            <w:tcW w:type="dxa" w:w="1134"/>
-          </w:tcPr>
-          <w:p>
-            <w:pPr>
-              <w:jc w:val="center"/>
-            </w:pPr>
-            <w:r/>
-            <w:r>
-              <w:rPr>
-                <w:sz w:val="18"/>
-              </w:rPr>
-              <w:t>17.2</w:t>
-            </w:r>
-          </w:p>
-        </w:tc>
-        <w:tc>
-          <w:tcPr>
-            <w:tcW w:type="dxa" w:w="1134"/>
-          </w:tcPr>
-          <w:p>
-            <w:pPr>
-              <w:jc w:val="center"/>
-            </w:pPr>
-            <w:r/>
-            <w:r>
-              <w:rPr>
-                <w:sz w:val="18"/>
-              </w:rPr>
-              <w:t>16.8</w:t>
-            </w:r>
-          </w:p>
-        </w:tc>
-        <w:tc>
-          <w:tcPr>
-            <w:tcW w:type="dxa" w:w="1134"/>
-          </w:tcPr>
-          <w:p>
-            <w:pPr>
-              <w:jc w:val="center"/>
-            </w:pPr>
-            <w:r/>
-            <w:r>
-              <w:rPr>
-                <w:sz w:val="18"/>
-              </w:rPr>
-              <w:t>17.8</w:t>
-            </w:r>
-          </w:p>
-        </w:tc>
-        <w:tc>
-          <w:tcPr>
-            <w:tcW w:type="dxa" w:w="1134"/>
-          </w:tcPr>
-          <w:p>
-            <w:pPr>
-              <w:jc w:val="center"/>
-            </w:pPr>
-            <w:r/>
-            <w:r>
-              <w:rPr>
-                <w:sz w:val="18"/>
-              </w:rPr>
-              <w:t>8.8</w:t>
-            </w:r>
-          </w:p>
-        </w:tc>
-        <w:tc>
-          <w:tcPr>
-            <w:tcW w:type="dxa" w:w="1134"/>
-          </w:tcPr>
-          <w:p>
-            <w:pPr>
-              <w:jc w:val="center"/>
-            </w:pPr>
-            <w:r/>
-            <w:r>
-              <w:rPr>
-                <w:sz w:val="18"/>
-              </w:rPr>
-              <w:t>5.8</w:t>
-            </w:r>
-          </w:p>
-        </w:tc>
-        <w:tc>
-          <w:tcPr>
-            <w:tcW w:type="dxa" w:w="1134"/>
-          </w:tcPr>
-          <w:p>
-            <w:pPr>
-              <w:jc w:val="center"/>
-            </w:pPr>
-            <w:r/>
-            <w:r>
-              <w:rPr>
-                <w:sz w:val="18"/>
-              </w:rPr>
-              <w:t>10.8</w:t>
-            </w:r>
-          </w:p>
-        </w:tc>
-        <w:tc>
-          <w:tcPr>
-            <w:tcW w:type="dxa" w:w="1134"/>
-          </w:tcPr>
-          <w:p>
-            <w:pPr>
-              <w:jc w:val="center"/>
-            </w:pPr>
-            <w:r/>
-            <w:r>
-              <w:rPr>
-                <w:sz w:val="18"/>
-              </w:rPr>
-              <w:t>8 of 8</w:t>
-            </w:r>
-          </w:p>
-        </w:tc>
-      </w:tr>
-    </w:tbl>
-    <w:p>
-      <w:pPr>
-        <w:spacing w:after="80"/>
-      </w:pPr>
-    </w:p>
-    <w:p>
-      <w:pPr>
-        <w:spacing w:after="160" w:line="276" w:lineRule="auto"/>
-      </w:pPr>
-      <w:r>
-        <w:rPr>
-          <w:b w:val="0"/>
-          <w:i/>
-          <w:sz w:val="20"/>
-        </w:rPr>
-        <w:t>Reductions are computed per image and then summarized; a positive value means that the Adaptive strategy was faster.</w:t>
-      </w:r>
     </w:p>
     <w:sectPr>
       <w:pgSz w:w="11906" w:h="16838"/>

</xml_diff>

<commit_message>
Chapter 4 summary: restrict 31.6% to grayscale, narrow verification wording
Co-Authored-By: Claude Sonnet 5.5 <noreply@anthropic.com>
Claude-Session: https://claude.ai/code/session_01T6gEewJ8YaCdmnsfS34RJd
</commit_message>
<xml_diff>
--- a/results/Chapter_4_final.docx
+++ b/results/Chapter_4_final.docx
@@ -6012,7 +6012,7 @@
           <w:b w:val="0"/>
           <w:i w:val="0"/>
         </w:rPr>
-        <w:t>At the same compression ratio, both standard codecs gave a higher reconstruction quality than the proposed codec: the mean PSNR was 32.69 dB for JPEG and 34.93 dB for JPEG 2000, compared with 29.49 dB for the proposed codec, and the mean SSIM was 0.8687 and 0.8967, compared with 0.8266. This result is expected, since JPEG and JPEG 2000 rely on transform coding, whereas the proposed codec uses plain vector quantization with a 64-entry codebook. The comparison is therefore provided as a reference only. The objective of this work is not to outperform these standards in rate–distortion terms but to accelerate the LBG codebook training with MPI without changing the compressed result. No execution-time comparison is made, because the implementations, optimization levels, and platforms differ.</w:t>
+        <w:t>At the same compression ratio, both standard codecs gave a higher reconstruction quality than the proposed codec: the mean PSNR was 32.69 dB for JPEG and 34.93 dB for JPEG 2000, compared with 29.49 dB for the proposed codec, and the mean SSIM was 0.8687 and 0.8967, compared with 0.8266. This result is expected, since JPEG and JPEG 2000 rely on transform coding, whereas the proposed codec uses plain vector quantization with a 64-entry codebook. The comparison is therefore provided as a reference only. The objective of this work is not to outperform these standards in rate–distortion terms but to accelerate the LBG codebook training with MPI without changing the verified reconstruction results. No execution-time comparison is made, because the implementations, optimization levels, and platforms differ.</w:t>
       </w:r>
     </w:p>
     <w:p>
@@ -12697,7 +12697,7 @@
           <w:b w:val="0"/>
           <w:i w:val="0"/>
         </w:rPr>
-        <w:t>With 4 × 4 blocks and a codebook of 64 codewords, the compression ratio ranged from 23.50–28.88 for the grayscale images and from 23.54–26.44 for the color images. The PSNR ranged from 29.11–29.75 dB and from 28.35–29.47 dB, and the SSIM from 0.7624–0.8855 and from 0.6964–0.8539, respectively. Delta coding reduced the entropy of the index sequence, and delta coding with Huffman coding increased the system compression ratio by 31.6% on average compared with fixed-length 6-bit indices. At the same compression ratio, JPEG and JPEG 2000 gave a higher reconstruction quality than the proposed codec; the comparison is a reference and not a claim of superiority.</w:t>
+        <w:t>With 4 × 4 blocks and a codebook of 64 codewords, the compression ratio ranged from 23.50–28.88 for the grayscale images and from 23.54–26.44 for the color images. The PSNR ranged from 29.11–29.75 dB and from 28.35–29.47 dB, and the SSIM from 0.7624–0.8855 and from 0.6964–0.8539, respectively. Delta coding reduced the entropy of the index sequence, and for the four grayscale images, delta coding with Huffman coding increased the compression ratio by 31.6% on average compared with fixed-length 6-bit indices. At approximately the same compression ratio, JPEG and JPEG 2000 gave a higher reconstruction quality than the proposed codec; the comparison is a reference and not a claim of superiority.</w:t>
       </w:r>
     </w:p>
     <w:p>
@@ -12723,7 +12723,7 @@
           <w:b w:val="0"/>
           <w:i w:val="0"/>
         </w:rPr>
-        <w:t>The Equal and Adaptive strategies gave nearly identical times for P = 2, 4, and 6. For P ≥ 8, the Adaptive strategy was faster for all eight images: it reduced the mean LBG time by 28.3% at P = 8 and 17.2% at P = 14, and the mean total time, including the calibration cost, by 17.9% and 8.8%, respectively. The verification experiments showed identical CR, MSE, PSNR, SSIM, LBG iteration counts, and reconstructed images between the sequential and the tested parallel configurations. Overall, MPI parallelization reduced the computational cost of the LBG stage without changing the compressed result, and adaptive workload distribution provided an additional benefit on the heterogeneous P-core and E-core platform. The conclusions and directions for future work are presented in the next chapter.</w:t>
+        <w:t>The Equal and Adaptive strategies gave nearly identical times for P = 2, 4, and 6. For P ≥ 8, the Adaptive strategy was faster for all eight images: it reduced the mean LBG time by 28.3% at P = 8 and 17.2% at P = 14, and the mean total time, including the calibration cost, by 17.9% and 8.8%, respectively. The verification experiments showed identical CR, MSE, PSNR, SSIM, LBG iteration counts, and reconstructed images between the sequential and the tested parallel configurations. Overall, MPI parallelization reduced the computational cost of the LBG stage without changing the verified reconstruction results, while adaptive workload distribution provided an additional benefit on the heterogeneous P-core and E-core platform. The conclusions and directions for future work are presented in the next chapter.</w:t>
       </w:r>
     </w:p>
     <w:p>

</xml_diff>